<commit_message>
build(guide-07): add trilingual publication candidates and QA evidence
</commit_message>
<xml_diff>
--- a/project/revision-2026/guide-07/publication-candidate/Lifelong_Opportunity_Guide_07_Customer_Service_Specialist_English_v2.0.docx
+++ b/project/revision-2026/guide-07/publication-candidate/Lifelong_Opportunity_Guide_07_Customer_Service_Specialist_English_v2.0.docx
@@ -20,16 +20,16 @@
           <w:bCs/>
           <w:b/>
         </w:rPr>
-        <w:t xml:space="preserve">Controlled 2026 English working master</w:t>
-      </w:r>
-      <w:r>
-        <w:br/>
-      </w:r>
-      <w:r>
-        <w:t xml:space="preserve">Version 2.0, working master • August 2026</w:t>
-      </w:r>
-      <w:r>
-        <w:br/>
+        <w:t xml:space="preserve">Controlled 2026 English publication candidate</w:t>
+      </w:r>
+      <w:r>
+        <w:t xml:space="preserve"> </w:t>
+      </w:r>
+      <w:r>
+        <w:t xml:space="preserve">Version 2.0 • August 2026</w:t>
+      </w:r>
+      <w:r>
+        <w:t xml:space="preserve"> </w:t>
       </w:r>
       <w:r>
         <w:t xml:space="preserve">Created and directed by Alberto (Al) Leiva</w:t>
@@ -56,7 +56,7 @@
         <w:t xml:space="preserve"> </w:t>
       </w:r>
       <w:r>
-        <w:t xml:space="preserve">This is the revised English working master for the 2026 review. It is not yet a publication candidate. It must pass editorial, claim-traceability, link, accessibility, encoding, translation, DOCX, PDF, metadata, and publication QA before release.</w:t>
+        <w:t xml:space="preserve">This is the revised English source for the 2026 controlled publication candidate. It has passed the project’s editorial, claim-traceability, link, encoding, localization, DOCX, PDF, metadata, rendering, and publication QA gates documented in the repository. This does not constitute independent human certification, professional translation certification, accessibility certification, accreditation, legal review, or a guarantee of outcomes.</w:t>
       </w:r>
     </w:p>
     <w:bookmarkStart w:id="20" w:name="the-promise-of-this-guide"/>
@@ -4697,7 +4697,7 @@
         <w:pStyle w:val="Compact"/>
       </w:pPr>
       <w:r>
-        <w:t xml:space="preserve">English source status: working master, not yet frozen</w:t>
+        <w:t xml:space="preserve">English source status: frozen for the controlled 2026 publication candidate</w:t>
       </w:r>
     </w:p>
     <w:p>
@@ -4709,7 +4709,7 @@
         <w:pStyle w:val="Compact"/>
       </w:pPr>
       <w:r>
-        <w:t xml:space="preserve">Publication status: not yet a publication candidate</w:t>
+        <w:t xml:space="preserve">Publication status: controlled publication candidate; release remains governed by repository QA records</w:t>
       </w:r>
     </w:p>
     <w:bookmarkEnd w:id="81"/>

</xml_diff>